<commit_message>
Add ten AI guides with policy and training downloads, and switch the site to US English
New pages: AI use policy template, Colorado AI Act for employers (SB 26-189),
AI hiring laws by state, can my employer see if I use ChatGPT, AI resume
screening, AI notetaker recording consent by state, jobs most exposed to AI,
AI in performance reviews, AI training for employees, ChatGPT prompts for HR.
Five new downloads (policy docx/pdf, training plan docx/xlsx/pdf).

Sitewide: British spellings converted to US spellings in page text, feed and
regenerated downloads; URL slugs and anchor ids unchanged.

Co-Authored-By: Claude Fable 5.1 <noreply@anthropic.com>
</commit_message>
<xml_diff>
--- a/downloads/employee-monitoring-consent-form.docx
+++ b/downloads/employee-monitoring-consent-form.docx
@@ -7,7 +7,7 @@
         <w:pStyle w:val="Title"/>
       </w:pPr>
       <w:r>
-        <w:t>Employee Monitoring Acknowledgement Form</w:t>
+        <w:t>Employee Monitoring Acknowledgment Form</w:t>
       </w:r>
     </w:p>
     <w:p>
@@ -23,7 +23,7 @@
         <w:pStyle w:val="Heading1"/>
       </w:pPr>
       <w:r>
-        <w:t>1. Full notice and acknowledgement</w:t>
+        <w:t>1. Full notice and acknowledgment</w:t>
       </w:r>
     </w:p>
     <w:p>
@@ -137,7 +137,7 @@
     </w:p>
     <w:p>
       <w:r>
-        <w:t>Delaware (Del. Code tit. 19, 705) allows an electronic notice shown at least once each day the employee accesses employer provided email or internet, instead of a one-time signed acknowledgement. The banner must appear every day, not once at setup.</w:t>
+        <w:t>Delaware (Del. Code tit. 19, 705) allows an electronic notice shown at least once each day the employee accesses employer provided email or internet, instead of a one-time signed acknowledgment. The banner must appear every day, not once at setup.</w:t>
       </w:r>
     </w:p>
     <w:p>
@@ -158,7 +158,7 @@
     </w:p>
     <w:p>
       <w:r>
-        <w:t>Keep the signed acknowledgement, the version of the policy it refers to, and the date, for the length of employment plus your general personnel record retention period. For Delaware banners, keep the system log showing the banner was displayed.</w:t>
+        <w:t>Keep the signed acknowledgment, the version of the policy it refers to, and the date, for the length of employment plus your general personnel record retention period. For Delaware banners, keep the system log showing the banner was displayed.</w:t>
       </w:r>
     </w:p>
     <w:p>

</xml_diff>